<commit_message>
Update portfolio document with revised content
Co-Authored-By: Claude Sonnet 4.6 <noreply@anthropic.com>
</commit_message>
<xml_diff>
--- a/포트폴리오 소개 문서.docx
+++ b/포트폴리오 소개 문서.docx
@@ -467,14 +467,12 @@
         </w:rPr>
         <w:t xml:space="preserve">, </w:t>
       </w:r>
-      <w:proofErr w:type="spellStart"/>
       <w:r>
         <w:rPr>
           <w:lang w:eastAsia="ko-KR"/>
         </w:rPr>
         <w:t>머신러닝</w:t>
       </w:r>
-      <w:proofErr w:type="spellEnd"/>
       <w:r>
         <w:rPr>
           <w:lang w:eastAsia="ko-KR"/>
@@ -894,7 +892,6 @@
       <w:pPr>
         <w:spacing w:before="240" w:after="80"/>
       </w:pPr>
-      <w:proofErr w:type="spellStart"/>
       <w:r>
         <w:rPr>
           <w:b/>
@@ -903,7 +900,6 @@
         </w:rPr>
         <w:t>기본</w:t>
       </w:r>
-      <w:proofErr w:type="spellEnd"/>
       <w:r>
         <w:rPr>
           <w:b/>
@@ -2433,14 +2429,12 @@
         <w:spacing w:after="40"/>
         <w:ind w:left="227"/>
       </w:pPr>
-      <w:proofErr w:type="spellStart"/>
       <w:r>
         <w:rPr>
           <w:sz w:val="21"/>
         </w:rPr>
         <w:t>출력</w:t>
       </w:r>
-      <w:proofErr w:type="spellEnd"/>
       <w:r>
         <w:rPr>
           <w:sz w:val="21"/>
@@ -3228,7 +3222,7 @@
         <w:spacing w:after="80"/>
         <w:ind w:left="454"/>
         <w:rPr>
-          <w:rFonts w:eastAsia="맑은 고딕" w:hint="eastAsia"/>
+          <w:rFonts w:eastAsia="맑은 고딕"/>
           <w:lang w:eastAsia="ko-KR"/>
         </w:rPr>
       </w:pPr>
@@ -3236,53 +3230,55 @@
     <w:p>
       <w:pPr>
         <w:spacing w:before="240" w:after="80"/>
+        <w:rPr>
+          <w:lang w:eastAsia="ko-KR"/>
+        </w:rPr>
       </w:pPr>
-      <w:proofErr w:type="spellStart"/>
       <w:r>
         <w:rPr>
           <w:b/>
           <w:color w:val="1A1A2E"/>
           <w:sz w:val="28"/>
+          <w:lang w:eastAsia="ko-KR"/>
         </w:rPr>
         <w:t>구조</w:t>
       </w:r>
-      <w:proofErr w:type="spellEnd"/>
       <w:r>
         <w:rPr>
           <w:b/>
           <w:color w:val="1A1A2E"/>
           <w:sz w:val="28"/>
-        </w:rPr>
-        <w:t xml:space="preserve"> </w:t>
-      </w:r>
-      <w:proofErr w:type="spellStart"/>
+          <w:lang w:eastAsia="ko-KR"/>
+        </w:rPr>
+        <w:t xml:space="preserve"> </w:t>
+      </w:r>
       <w:r>
         <w:rPr>
           <w:b/>
           <w:color w:val="1A1A2E"/>
           <w:sz w:val="28"/>
+          <w:lang w:eastAsia="ko-KR"/>
         </w:rPr>
         <w:t>선택의</w:t>
       </w:r>
-      <w:proofErr w:type="spellEnd"/>
       <w:r>
         <w:rPr>
           <w:b/>
           <w:color w:val="1A1A2E"/>
           <w:sz w:val="28"/>
-        </w:rPr>
-        <w:t xml:space="preserve"> </w:t>
-      </w:r>
-      <w:proofErr w:type="spellStart"/>
+          <w:lang w:eastAsia="ko-KR"/>
+        </w:rPr>
+        <w:t xml:space="preserve"> </w:t>
+      </w:r>
       <w:r>
         <w:rPr>
           <w:b/>
           <w:color w:val="1A1A2E"/>
           <w:sz w:val="28"/>
+          <w:lang w:eastAsia="ko-KR"/>
         </w:rPr>
         <w:t>이유</w:t>
       </w:r>
-      <w:proofErr w:type="spellEnd"/>
     </w:p>
     <w:p>
       <w:pPr>
@@ -3938,7 +3934,6 @@
               </w:rPr>
               <w:t xml:space="preserve"> JSON </w:t>
             </w:r>
-            <w:proofErr w:type="spellStart"/>
             <w:r>
               <w:rPr>
                 <w:b/>
@@ -3948,7 +3943,6 @@
               </w:rPr>
               <w:t>캐싱</w:t>
             </w:r>
-            <w:proofErr w:type="spellEnd"/>
           </w:p>
         </w:tc>
         <w:tc>
@@ -4157,17 +4151,8 @@
                 <w:sz w:val="20"/>
                 <w:lang w:eastAsia="ko-KR"/>
               </w:rPr>
-              <w:t xml:space="preserve"> </w:t>
-            </w:r>
-            <w:proofErr w:type="spellStart"/>
-            <w:r>
-              <w:rPr>
-                <w:sz w:val="20"/>
-                <w:lang w:eastAsia="ko-KR"/>
-              </w:rPr>
-              <w:t>model_output.json</w:t>
-            </w:r>
-            <w:proofErr w:type="spellEnd"/>
+              <w:t xml:space="preserve"> model_output.json</w:t>
+            </w:r>
             <w:r>
               <w:rPr>
                 <w:sz w:val="20"/>
@@ -6187,7 +6172,6 @@
             <w:shd w:val="clear" w:color="auto" w:fill="F3F4F6"/>
           </w:tcPr>
           <w:p>
-            <w:proofErr w:type="spellStart"/>
             <w:r>
               <w:rPr>
                 <w:b/>
@@ -6196,7 +6180,6 @@
               </w:rPr>
               <w:t>입력</w:t>
             </w:r>
-            <w:proofErr w:type="spellEnd"/>
             <w:r>
               <w:rPr>
                 <w:b/>
@@ -6317,6 +6300,169 @@
                 <w:lang w:eastAsia="ko-KR"/>
               </w:rPr>
               <w:t>비중</w:t>
+            </w:r>
+          </w:p>
+        </w:tc>
+      </w:tr>
+      <w:tr>
+        <w:tc>
+          <w:tcPr>
+            <w:tcW w:w="4536" w:type="dxa"/>
+            <w:shd w:val="clear" w:color="auto" w:fill="F3F4F6"/>
+          </w:tcPr>
+          <w:p>
+            <w:r>
+              <w:rPr>
+                <w:b/>
+                <w:color w:val="1A1A2E"/>
+                <w:sz w:val="20"/>
+              </w:rPr>
+              <w:t>알고리즘</w:t>
+            </w:r>
+          </w:p>
+        </w:tc>
+        <w:tc>
+          <w:tcPr>
+            <w:tcW w:w="4536" w:type="dxa"/>
+          </w:tcPr>
+          <w:p>
+            <w:r>
+              <w:rPr>
+                <w:sz w:val="20"/>
+              </w:rPr>
+              <w:t>Rolling Window (12M) Z-score</w:t>
+            </w:r>
+          </w:p>
+        </w:tc>
+      </w:tr>
+      <w:tr>
+        <w:tc>
+          <w:tcPr>
+            <w:tcW w:w="4536" w:type="dxa"/>
+            <w:shd w:val="clear" w:color="auto" w:fill="F3F4F6"/>
+          </w:tcPr>
+          <w:p>
+            <w:r>
+              <w:rPr>
+                <w:b/>
+                <w:color w:val="1A1A2E"/>
+                <w:sz w:val="20"/>
+              </w:rPr>
+              <w:t>출력</w:t>
+            </w:r>
+          </w:p>
+        </w:tc>
+        <w:tc>
+          <w:tcPr>
+            <w:tcW w:w="4536" w:type="dxa"/>
+          </w:tcPr>
+          <w:p>
+            <w:pPr>
+              <w:rPr>
+                <w:lang w:eastAsia="ko-KR"/>
+              </w:rPr>
+            </w:pPr>
+            <w:proofErr w:type="spellStart"/>
+            <w:r>
+              <w:rPr>
+                <w:sz w:val="20"/>
+                <w:lang w:eastAsia="ko-KR"/>
+              </w:rPr>
+              <w:t>sw_z</w:t>
+            </w:r>
+            <w:proofErr w:type="spellEnd"/>
+            <w:r>
+              <w:rPr>
+                <w:sz w:val="20"/>
+                <w:lang w:eastAsia="ko-KR"/>
+              </w:rPr>
+              <w:t xml:space="preserve"> (</w:t>
+            </w:r>
+            <w:r>
+              <w:rPr>
+                <w:sz w:val="20"/>
+                <w:lang w:eastAsia="ko-KR"/>
+              </w:rPr>
+              <w:t>이탈</w:t>
+            </w:r>
+            <w:r>
+              <w:rPr>
+                <w:sz w:val="20"/>
+                <w:lang w:eastAsia="ko-KR"/>
+              </w:rPr>
+              <w:t xml:space="preserve"> </w:t>
+            </w:r>
+            <w:r>
+              <w:rPr>
+                <w:sz w:val="20"/>
+                <w:lang w:eastAsia="ko-KR"/>
+              </w:rPr>
+              <w:t>크기</w:t>
+            </w:r>
+            <w:r>
+              <w:rPr>
+                <w:sz w:val="20"/>
+                <w:lang w:eastAsia="ko-KR"/>
+              </w:rPr>
+              <w:t xml:space="preserve">), </w:t>
+            </w:r>
+            <w:proofErr w:type="spellStart"/>
+            <w:r>
+              <w:rPr>
+                <w:sz w:val="20"/>
+                <w:lang w:eastAsia="ko-KR"/>
+              </w:rPr>
+              <w:t>sw_signal</w:t>
+            </w:r>
+            <w:proofErr w:type="spellEnd"/>
+            <w:r>
+              <w:rPr>
+                <w:sz w:val="20"/>
+                <w:lang w:eastAsia="ko-KR"/>
+              </w:rPr>
+              <w:t xml:space="preserve"> (</w:t>
+            </w:r>
+            <w:r>
+              <w:rPr>
+                <w:sz w:val="20"/>
+                <w:lang w:eastAsia="ko-KR"/>
+              </w:rPr>
+              <w:t>정상</w:t>
+            </w:r>
+            <w:r>
+              <w:rPr>
+                <w:sz w:val="20"/>
+                <w:lang w:eastAsia="ko-KR"/>
+              </w:rPr>
+              <w:t>/</w:t>
+            </w:r>
+            <w:r>
+              <w:rPr>
+                <w:sz w:val="20"/>
+                <w:lang w:eastAsia="ko-KR"/>
+              </w:rPr>
+              <w:t>주의</w:t>
+            </w:r>
+            <w:r>
+              <w:rPr>
+                <w:sz w:val="20"/>
+                <w:lang w:eastAsia="ko-KR"/>
+              </w:rPr>
+              <w:t>/</w:t>
+            </w:r>
+            <w:r>
+              <w:rPr>
+                <w:sz w:val="20"/>
+                <w:lang w:eastAsia="ko-KR"/>
+              </w:rPr>
+              <w:t>경고</w:t>
+            </w:r>
+            <w:r>
+              <w:rPr>
+                <w:sz w:val="20"/>
+                <w:lang w:eastAsia="ko-KR"/>
+              </w:rPr>
+              <w:t>)</w:t>
             </w:r>
           </w:p>
         </w:tc>
@@ -6335,171 +6481,6 @@
                 <w:color w:val="1A1A2E"/>
                 <w:sz w:val="20"/>
               </w:rPr>
-              <w:t>알고리즘</w:t>
-            </w:r>
-            <w:proofErr w:type="spellEnd"/>
-          </w:p>
-        </w:tc>
-        <w:tc>
-          <w:tcPr>
-            <w:tcW w:w="4536" w:type="dxa"/>
-          </w:tcPr>
-          <w:p>
-            <w:r>
-              <w:rPr>
-                <w:sz w:val="20"/>
-              </w:rPr>
-              <w:t>Rolling Window (12M) Z-score</w:t>
-            </w:r>
-          </w:p>
-        </w:tc>
-      </w:tr>
-      <w:tr>
-        <w:tc>
-          <w:tcPr>
-            <w:tcW w:w="4536" w:type="dxa"/>
-            <w:shd w:val="clear" w:color="auto" w:fill="F3F4F6"/>
-          </w:tcPr>
-          <w:p>
-            <w:r>
-              <w:rPr>
-                <w:b/>
-                <w:color w:val="1A1A2E"/>
-                <w:sz w:val="20"/>
-              </w:rPr>
-              <w:t>출력</w:t>
-            </w:r>
-          </w:p>
-        </w:tc>
-        <w:tc>
-          <w:tcPr>
-            <w:tcW w:w="4536" w:type="dxa"/>
-          </w:tcPr>
-          <w:p>
-            <w:pPr>
-              <w:rPr>
-                <w:lang w:eastAsia="ko-KR"/>
-              </w:rPr>
-            </w:pPr>
-            <w:proofErr w:type="spellStart"/>
-            <w:r>
-              <w:rPr>
-                <w:sz w:val="20"/>
-                <w:lang w:eastAsia="ko-KR"/>
-              </w:rPr>
-              <w:t>sw_z</w:t>
-            </w:r>
-            <w:proofErr w:type="spellEnd"/>
-            <w:r>
-              <w:rPr>
-                <w:sz w:val="20"/>
-                <w:lang w:eastAsia="ko-KR"/>
-              </w:rPr>
-              <w:t xml:space="preserve"> (</w:t>
-            </w:r>
-            <w:r>
-              <w:rPr>
-                <w:sz w:val="20"/>
-                <w:lang w:eastAsia="ko-KR"/>
-              </w:rPr>
-              <w:t>이탈</w:t>
-            </w:r>
-            <w:r>
-              <w:rPr>
-                <w:sz w:val="20"/>
-                <w:lang w:eastAsia="ko-KR"/>
-              </w:rPr>
-              <w:t xml:space="preserve"> </w:t>
-            </w:r>
-            <w:r>
-              <w:rPr>
-                <w:sz w:val="20"/>
-                <w:lang w:eastAsia="ko-KR"/>
-              </w:rPr>
-              <w:t>크기</w:t>
-            </w:r>
-            <w:r>
-              <w:rPr>
-                <w:sz w:val="20"/>
-                <w:lang w:eastAsia="ko-KR"/>
-              </w:rPr>
-              <w:t xml:space="preserve">), </w:t>
-            </w:r>
-            <w:proofErr w:type="spellStart"/>
-            <w:r>
-              <w:rPr>
-                <w:sz w:val="20"/>
-                <w:lang w:eastAsia="ko-KR"/>
-              </w:rPr>
-              <w:t>sw_signal</w:t>
-            </w:r>
-            <w:proofErr w:type="spellEnd"/>
-            <w:r>
-              <w:rPr>
-                <w:sz w:val="20"/>
-                <w:lang w:eastAsia="ko-KR"/>
-              </w:rPr>
-              <w:t xml:space="preserve"> (</w:t>
-            </w:r>
-            <w:r>
-              <w:rPr>
-                <w:sz w:val="20"/>
-                <w:lang w:eastAsia="ko-KR"/>
-              </w:rPr>
-              <w:t>정상</w:t>
-            </w:r>
-            <w:r>
-              <w:rPr>
-                <w:sz w:val="20"/>
-                <w:lang w:eastAsia="ko-KR"/>
-              </w:rPr>
-              <w:t>/</w:t>
-            </w:r>
-            <w:r>
-              <w:rPr>
-                <w:sz w:val="20"/>
-                <w:lang w:eastAsia="ko-KR"/>
-              </w:rPr>
-              <w:t>주의</w:t>
-            </w:r>
-            <w:r>
-              <w:rPr>
-                <w:sz w:val="20"/>
-                <w:lang w:eastAsia="ko-KR"/>
-              </w:rPr>
-              <w:t>/</w:t>
-            </w:r>
-            <w:r>
-              <w:rPr>
-                <w:sz w:val="20"/>
-                <w:lang w:eastAsia="ko-KR"/>
-              </w:rPr>
-              <w:t>경고</w:t>
-            </w:r>
-            <w:r>
-              <w:rPr>
-                <w:sz w:val="20"/>
-                <w:lang w:eastAsia="ko-KR"/>
-              </w:rPr>
-              <w:t>)</w:t>
-            </w:r>
-          </w:p>
-        </w:tc>
-      </w:tr>
-      <w:tr>
-        <w:tc>
-          <w:tcPr>
-            <w:tcW w:w="4536" w:type="dxa"/>
-            <w:shd w:val="clear" w:color="auto" w:fill="F3F4F6"/>
-          </w:tcPr>
-          <w:p>
-            <w:proofErr w:type="spellStart"/>
-            <w:r>
-              <w:rPr>
-                <w:b/>
-                <w:color w:val="1A1A2E"/>
-                <w:sz w:val="20"/>
-              </w:rPr>
               <w:t>판정</w:t>
             </w:r>
             <w:proofErr w:type="spellEnd"/>
@@ -6671,7 +6652,6 @@
           <w:lang w:eastAsia="ko-KR"/>
         </w:rPr>
       </w:pPr>
-      <w:proofErr w:type="spellStart"/>
       <w:r>
         <w:rPr>
           <w:sz w:val="21"/>
@@ -6679,7 +6659,6 @@
         </w:rPr>
         <w:t>롤오버</w:t>
       </w:r>
-      <w:proofErr w:type="spellEnd"/>
       <w:r>
         <w:rPr>
           <w:sz w:val="21"/>
@@ -6901,7 +6880,6 @@
             <w:shd w:val="clear" w:color="auto" w:fill="F3F4F6"/>
           </w:tcPr>
           <w:p>
-            <w:proofErr w:type="spellStart"/>
             <w:r>
               <w:rPr>
                 <w:b/>
@@ -6910,7 +6888,6 @@
               </w:rPr>
               <w:t>입력</w:t>
             </w:r>
-            <w:proofErr w:type="spellEnd"/>
             <w:r>
               <w:rPr>
                 <w:b/>
@@ -9095,7 +9072,6 @@
       <w:pPr>
         <w:spacing w:before="240" w:after="80"/>
       </w:pPr>
-      <w:proofErr w:type="spellStart"/>
       <w:r>
         <w:rPr>
           <w:b/>
@@ -9104,7 +9080,6 @@
         </w:rPr>
         <w:t>치환</w:t>
       </w:r>
-      <w:proofErr w:type="spellEnd"/>
       <w:r>
         <w:rPr>
           <w:b/>
@@ -9683,21 +9658,12 @@
           <w:lang w:eastAsia="ko-KR"/>
         </w:rPr>
       </w:pPr>
-      <w:proofErr w:type="spellStart"/>
-      <w:r>
-        <w:rPr>
-          <w:sz w:val="21"/>
-          <w:lang w:eastAsia="ko-KR"/>
-        </w:rPr>
-        <w:t>mail_archive</w:t>
-      </w:r>
-      <w:proofErr w:type="spellEnd"/>
-      <w:r>
-        <w:rPr>
-          <w:sz w:val="21"/>
-          <w:lang w:eastAsia="ko-KR"/>
-        </w:rPr>
-        <w:t>/ 12</w:t>
+      <w:r>
+        <w:rPr>
+          <w:sz w:val="21"/>
+          <w:lang w:eastAsia="ko-KR"/>
+        </w:rPr>
+        <w:t>mail_archive/ 12</w:t>
       </w:r>
       <w:r>
         <w:rPr>
@@ -12627,14 +12593,12 @@
         <w:spacing w:after="40"/>
         <w:ind w:left="227"/>
       </w:pPr>
-      <w:proofErr w:type="spellStart"/>
       <w:r>
         <w:rPr>
           <w:sz w:val="21"/>
         </w:rPr>
         <w:t>모델</w:t>
       </w:r>
-      <w:proofErr w:type="spellEnd"/>
       <w:r>
         <w:rPr>
           <w:sz w:val="21"/>
@@ -15637,34 +15601,920 @@
     <w:p>
       <w:pPr>
         <w:spacing w:before="240" w:after="80"/>
+        <w:rPr>
+          <w:lang w:eastAsia="ko-KR"/>
+        </w:rPr>
       </w:pPr>
-      <w:proofErr w:type="spellStart"/>
       <w:r>
         <w:rPr>
           <w:b/>
           <w:color w:val="1A1A2E"/>
           <w:sz w:val="28"/>
+          <w:lang w:eastAsia="ko-KR"/>
         </w:rPr>
         <w:t>데이터</w:t>
       </w:r>
-      <w:proofErr w:type="spellEnd"/>
       <w:r>
         <w:rPr>
           <w:b/>
           <w:color w:val="1A1A2E"/>
           <w:sz w:val="28"/>
-        </w:rPr>
-        <w:t xml:space="preserve"> </w:t>
-      </w:r>
-      <w:proofErr w:type="spellStart"/>
+          <w:lang w:eastAsia="ko-KR"/>
+        </w:rPr>
+        <w:t xml:space="preserve"> </w:t>
+      </w:r>
       <w:r>
         <w:rPr>
           <w:b/>
           <w:color w:val="1A1A2E"/>
           <w:sz w:val="28"/>
+          <w:lang w:eastAsia="ko-KR"/>
         </w:rPr>
         <w:t>엔지니어링</w:t>
       </w:r>
+    </w:p>
+    <w:p>
+      <w:pPr>
+        <w:pStyle w:val="a0"/>
+        <w:spacing w:after="40"/>
+        <w:ind w:left="227"/>
+      </w:pPr>
+      <w:r>
+        <w:rPr>
+          <w:sz w:val="21"/>
+        </w:rPr>
+        <w:t xml:space="preserve">Selenium + </w:t>
+      </w:r>
+      <w:proofErr w:type="spellStart"/>
+      <w:r>
+        <w:rPr>
+          <w:sz w:val="21"/>
+        </w:rPr>
+        <w:t>WebDriverManager</w:t>
+      </w:r>
+      <w:proofErr w:type="spellEnd"/>
+      <w:r>
+        <w:rPr>
+          <w:sz w:val="21"/>
+        </w:rPr>
+        <w:t xml:space="preserve"> </w:t>
+      </w:r>
+      <w:proofErr w:type="spellStart"/>
+      <w:r>
+        <w:rPr>
+          <w:sz w:val="21"/>
+        </w:rPr>
+        <w:t>기반</w:t>
+      </w:r>
+      <w:proofErr w:type="spellEnd"/>
+      <w:r>
+        <w:rPr>
+          <w:sz w:val="21"/>
+        </w:rPr>
+        <w:t xml:space="preserve"> </w:t>
+      </w:r>
+      <w:proofErr w:type="spellStart"/>
+      <w:r>
+        <w:rPr>
+          <w:sz w:val="21"/>
+        </w:rPr>
+        <w:t>Seibro</w:t>
+      </w:r>
+      <w:proofErr w:type="spellEnd"/>
+      <w:r>
+        <w:rPr>
+          <w:sz w:val="21"/>
+        </w:rPr>
+        <w:t xml:space="preserve"> </w:t>
+      </w:r>
+      <w:proofErr w:type="spellStart"/>
+      <w:r>
+        <w:rPr>
+          <w:sz w:val="21"/>
+        </w:rPr>
+        <w:t>자동</w:t>
+      </w:r>
+      <w:proofErr w:type="spellEnd"/>
+      <w:r>
+        <w:rPr>
+          <w:sz w:val="21"/>
+        </w:rPr>
+        <w:t xml:space="preserve"> </w:t>
+      </w:r>
+      <w:proofErr w:type="spellStart"/>
+      <w:r>
+        <w:rPr>
+          <w:sz w:val="21"/>
+        </w:rPr>
+        <w:t>크롤링</w:t>
+      </w:r>
+      <w:proofErr w:type="spellEnd"/>
+    </w:p>
+    <w:p>
+      <w:pPr>
+        <w:pStyle w:val="a0"/>
+        <w:spacing w:after="40"/>
+        <w:ind w:left="227"/>
+        <w:rPr>
+          <w:lang w:eastAsia="ko-KR"/>
+        </w:rPr>
+      </w:pPr>
+      <w:r>
+        <w:rPr>
+          <w:sz w:val="21"/>
+          <w:lang w:eastAsia="ko-KR"/>
+        </w:rPr>
+        <w:t>다양한</w:t>
+      </w:r>
+      <w:r>
+        <w:rPr>
+          <w:sz w:val="21"/>
+          <w:lang w:eastAsia="ko-KR"/>
+        </w:rPr>
+        <w:t xml:space="preserve"> </w:t>
+      </w:r>
+      <w:proofErr w:type="spellStart"/>
+      <w:r>
+        <w:rPr>
+          <w:sz w:val="21"/>
+          <w:lang w:eastAsia="ko-KR"/>
+        </w:rPr>
+        <w:t>인코딩</w:t>
+      </w:r>
+      <w:proofErr w:type="spellEnd"/>
+      <w:r>
+        <w:rPr>
+          <w:sz w:val="21"/>
+          <w:lang w:eastAsia="ko-KR"/>
+        </w:rPr>
+        <w:t xml:space="preserve">(UTF-8-sig / CP949) </w:t>
+      </w:r>
+      <w:r>
+        <w:rPr>
+          <w:sz w:val="21"/>
+          <w:lang w:eastAsia="ko-KR"/>
+        </w:rPr>
+        <w:t>자동</w:t>
+      </w:r>
+      <w:r>
+        <w:rPr>
+          <w:sz w:val="21"/>
+          <w:lang w:eastAsia="ko-KR"/>
+        </w:rPr>
+        <w:t xml:space="preserve"> </w:t>
+      </w:r>
+      <w:r>
+        <w:rPr>
+          <w:sz w:val="21"/>
+          <w:lang w:eastAsia="ko-KR"/>
+        </w:rPr>
+        <w:t>감지</w:t>
+      </w:r>
+      <w:r>
+        <w:rPr>
+          <w:sz w:val="21"/>
+          <w:lang w:eastAsia="ko-KR"/>
+        </w:rPr>
+        <w:t xml:space="preserve"> CSV </w:t>
+      </w:r>
+      <w:r>
+        <w:rPr>
+          <w:sz w:val="21"/>
+          <w:lang w:eastAsia="ko-KR"/>
+        </w:rPr>
+        <w:t>로더</w:t>
+      </w:r>
+    </w:p>
+    <w:p>
+      <w:pPr>
+        <w:pStyle w:val="a0"/>
+        <w:spacing w:after="40"/>
+        <w:ind w:left="227"/>
+        <w:rPr>
+          <w:lang w:eastAsia="ko-KR"/>
+        </w:rPr>
+      </w:pPr>
+      <w:r>
+        <w:rPr>
+          <w:sz w:val="21"/>
+          <w:lang w:eastAsia="ko-KR"/>
+        </w:rPr>
+        <w:t>신용등급</w:t>
+      </w:r>
+      <w:r>
+        <w:rPr>
+          <w:sz w:val="21"/>
+          <w:lang w:eastAsia="ko-KR"/>
+        </w:rPr>
+        <w:t xml:space="preserve"> </w:t>
+      </w:r>
+      <w:r>
+        <w:rPr>
+          <w:sz w:val="21"/>
+          <w:lang w:eastAsia="ko-KR"/>
+        </w:rPr>
+        <w:t>정규화</w:t>
+      </w:r>
+      <w:r>
+        <w:rPr>
+          <w:sz w:val="21"/>
+          <w:lang w:eastAsia="ko-KR"/>
+        </w:rPr>
+        <w:t xml:space="preserve">: </w:t>
+      </w:r>
+      <w:r>
+        <w:rPr>
+          <w:sz w:val="21"/>
+          <w:lang w:eastAsia="ko-KR"/>
+        </w:rPr>
+        <w:t>전각문자</w:t>
+      </w:r>
+      <w:r>
+        <w:rPr>
+          <w:sz w:val="21"/>
+          <w:lang w:eastAsia="ko-KR"/>
+        </w:rPr>
+        <w:t>·</w:t>
+      </w:r>
+      <w:r>
+        <w:rPr>
+          <w:sz w:val="21"/>
+          <w:lang w:eastAsia="ko-KR"/>
+        </w:rPr>
+        <w:t>특수기호</w:t>
+      </w:r>
+      <w:r>
+        <w:rPr>
+          <w:sz w:val="21"/>
+          <w:lang w:eastAsia="ko-KR"/>
+        </w:rPr>
+        <w:t xml:space="preserve"> </w:t>
+      </w:r>
+      <w:r>
+        <w:rPr>
+          <w:sz w:val="21"/>
+          <w:lang w:eastAsia="ko-KR"/>
+        </w:rPr>
+        <w:t>포함</w:t>
+      </w:r>
+      <w:r>
+        <w:rPr>
+          <w:sz w:val="21"/>
+          <w:lang w:eastAsia="ko-KR"/>
+        </w:rPr>
+        <w:t xml:space="preserve"> </w:t>
+      </w:r>
+      <w:r>
+        <w:rPr>
+          <w:sz w:val="21"/>
+          <w:lang w:eastAsia="ko-KR"/>
+        </w:rPr>
+        <w:t>원천</w:t>
+      </w:r>
+      <w:r>
+        <w:rPr>
+          <w:sz w:val="21"/>
+          <w:lang w:eastAsia="ko-KR"/>
+        </w:rPr>
+        <w:t xml:space="preserve"> → A1/A2+/A2/… </w:t>
+      </w:r>
+      <w:r>
+        <w:rPr>
+          <w:sz w:val="21"/>
+          <w:lang w:eastAsia="ko-KR"/>
+        </w:rPr>
+        <w:t>표준</w:t>
+      </w:r>
+      <w:r>
+        <w:rPr>
+          <w:sz w:val="21"/>
+          <w:lang w:eastAsia="ko-KR"/>
+        </w:rPr>
+        <w:t xml:space="preserve"> </w:t>
+      </w:r>
+      <w:r>
+        <w:rPr>
+          <w:sz w:val="21"/>
+          <w:lang w:eastAsia="ko-KR"/>
+        </w:rPr>
+        <w:t>코드</w:t>
+      </w:r>
+    </w:p>
+    <w:p>
+      <w:pPr>
+        <w:pStyle w:val="a0"/>
+        <w:spacing w:after="40"/>
+        <w:ind w:left="227"/>
+        <w:rPr>
+          <w:lang w:eastAsia="ko-KR"/>
+        </w:rPr>
+      </w:pPr>
+      <w:r>
+        <w:rPr>
+          <w:sz w:val="21"/>
+          <w:lang w:eastAsia="ko-KR"/>
+        </w:rPr>
+        <w:t>월별</w:t>
+      </w:r>
+      <w:r>
+        <w:rPr>
+          <w:sz w:val="21"/>
+          <w:lang w:eastAsia="ko-KR"/>
+        </w:rPr>
+        <w:t xml:space="preserve"> incremental append: </w:t>
+      </w:r>
+      <w:r>
+        <w:rPr>
+          <w:sz w:val="21"/>
+          <w:lang w:eastAsia="ko-KR"/>
+        </w:rPr>
+        <w:t>이전</w:t>
+      </w:r>
+      <w:r>
+        <w:rPr>
+          <w:sz w:val="21"/>
+          <w:lang w:eastAsia="ko-KR"/>
+        </w:rPr>
+        <w:t xml:space="preserve"> </w:t>
+      </w:r>
+      <w:proofErr w:type="spellStart"/>
+      <w:r>
+        <w:rPr>
+          <w:sz w:val="21"/>
+          <w:lang w:eastAsia="ko-KR"/>
+        </w:rPr>
+        <w:t>누적본</w:t>
+      </w:r>
+      <w:proofErr w:type="spellEnd"/>
+      <w:r>
+        <w:rPr>
+          <w:sz w:val="21"/>
+          <w:lang w:eastAsia="ko-KR"/>
+        </w:rPr>
+        <w:t xml:space="preserve"> + </w:t>
+      </w:r>
+      <w:r>
+        <w:rPr>
+          <w:sz w:val="21"/>
+          <w:lang w:eastAsia="ko-KR"/>
+        </w:rPr>
+        <w:t>신규</w:t>
+      </w:r>
+      <w:r>
+        <w:rPr>
+          <w:sz w:val="21"/>
+          <w:lang w:eastAsia="ko-KR"/>
+        </w:rPr>
+        <w:t xml:space="preserve"> 1</w:t>
+      </w:r>
+      <w:r>
+        <w:rPr>
+          <w:sz w:val="21"/>
+          <w:lang w:eastAsia="ko-KR"/>
+        </w:rPr>
+        <w:t>개월</w:t>
+      </w:r>
+      <w:r>
+        <w:rPr>
+          <w:sz w:val="21"/>
+          <w:lang w:eastAsia="ko-KR"/>
+        </w:rPr>
+        <w:t xml:space="preserve"> → </w:t>
+      </w:r>
+      <w:r>
+        <w:rPr>
+          <w:sz w:val="21"/>
+          <w:lang w:eastAsia="ko-KR"/>
+        </w:rPr>
+        <w:t>중복</w:t>
+      </w:r>
+      <w:r>
+        <w:rPr>
+          <w:sz w:val="21"/>
+          <w:lang w:eastAsia="ko-KR"/>
+        </w:rPr>
+        <w:t xml:space="preserve"> </w:t>
+      </w:r>
+      <w:r>
+        <w:rPr>
+          <w:sz w:val="21"/>
+          <w:lang w:eastAsia="ko-KR"/>
+        </w:rPr>
+        <w:t>제거</w:t>
+      </w:r>
+      <w:r>
+        <w:rPr>
+          <w:sz w:val="21"/>
+          <w:lang w:eastAsia="ko-KR"/>
+        </w:rPr>
+        <w:t xml:space="preserve"> </w:t>
+      </w:r>
+      <w:r>
+        <w:rPr>
+          <w:sz w:val="21"/>
+          <w:lang w:eastAsia="ko-KR"/>
+        </w:rPr>
+        <w:t>후</w:t>
+      </w:r>
+      <w:r>
+        <w:rPr>
+          <w:sz w:val="21"/>
+          <w:lang w:eastAsia="ko-KR"/>
+        </w:rPr>
+        <w:t xml:space="preserve"> </w:t>
+      </w:r>
+      <w:r>
+        <w:rPr>
+          <w:sz w:val="21"/>
+          <w:lang w:eastAsia="ko-KR"/>
+        </w:rPr>
+        <w:t>저장</w:t>
+      </w:r>
+    </w:p>
+    <w:p>
+      <w:pPr>
+        <w:spacing w:before="240" w:after="80"/>
+      </w:pPr>
+      <w:r>
+        <w:rPr>
+          <w:b/>
+          <w:color w:val="1A1A2E"/>
+          <w:sz w:val="28"/>
+        </w:rPr>
+        <w:t xml:space="preserve">ML </w:t>
+      </w:r>
+      <w:proofErr w:type="spellStart"/>
+      <w:r>
+        <w:rPr>
+          <w:b/>
+          <w:color w:val="1A1A2E"/>
+          <w:sz w:val="28"/>
+        </w:rPr>
+        <w:t>파이프라인</w:t>
+      </w:r>
+      <w:proofErr w:type="spellEnd"/>
+    </w:p>
+    <w:p>
+      <w:pPr>
+        <w:pStyle w:val="a0"/>
+        <w:spacing w:after="40"/>
+        <w:ind w:left="227"/>
+        <w:rPr>
+          <w:lang w:eastAsia="ko-KR"/>
+        </w:rPr>
+      </w:pPr>
+      <w:r>
+        <w:rPr>
+          <w:sz w:val="21"/>
+          <w:lang w:eastAsia="ko-KR"/>
+        </w:rPr>
+        <w:t>학습은</w:t>
+      </w:r>
+      <w:r>
+        <w:rPr>
+          <w:sz w:val="21"/>
+          <w:lang w:eastAsia="ko-KR"/>
+        </w:rPr>
+        <w:t xml:space="preserve"> </w:t>
+      </w:r>
+      <w:r>
+        <w:rPr>
+          <w:sz w:val="21"/>
+          <w:lang w:eastAsia="ko-KR"/>
+        </w:rPr>
+        <w:t>최초</w:t>
+      </w:r>
+      <w:r>
+        <w:rPr>
+          <w:sz w:val="21"/>
+          <w:lang w:eastAsia="ko-KR"/>
+        </w:rPr>
+        <w:t xml:space="preserve"> 1</w:t>
+      </w:r>
+      <w:r>
+        <w:rPr>
+          <w:sz w:val="21"/>
+          <w:lang w:eastAsia="ko-KR"/>
+        </w:rPr>
+        <w:t>회</w:t>
+      </w:r>
+      <w:r>
+        <w:rPr>
+          <w:sz w:val="21"/>
+          <w:lang w:eastAsia="ko-KR"/>
+        </w:rPr>
+        <w:t xml:space="preserve">, </w:t>
+      </w:r>
+      <w:r>
+        <w:rPr>
+          <w:sz w:val="21"/>
+          <w:lang w:eastAsia="ko-KR"/>
+        </w:rPr>
+        <w:t>이후</w:t>
+      </w:r>
+      <w:r>
+        <w:rPr>
+          <w:sz w:val="21"/>
+          <w:lang w:eastAsia="ko-KR"/>
+        </w:rPr>
+        <w:t xml:space="preserve"> apply_saved_model()</w:t>
+      </w:r>
+      <w:r>
+        <w:rPr>
+          <w:sz w:val="21"/>
+          <w:lang w:eastAsia="ko-KR"/>
+        </w:rPr>
+        <w:t>로</w:t>
+      </w:r>
+      <w:r>
+        <w:rPr>
+          <w:sz w:val="21"/>
+          <w:lang w:eastAsia="ko-KR"/>
+        </w:rPr>
+        <w:t xml:space="preserve"> pkl </w:t>
+      </w:r>
+      <w:r>
+        <w:rPr>
+          <w:sz w:val="21"/>
+          <w:lang w:eastAsia="ko-KR"/>
+        </w:rPr>
+        <w:t>재사용</w:t>
+      </w:r>
+      <w:r>
+        <w:rPr>
+          <w:sz w:val="21"/>
+          <w:lang w:eastAsia="ko-KR"/>
+        </w:rPr>
+        <w:t xml:space="preserve"> → </w:t>
+      </w:r>
+      <w:r>
+        <w:rPr>
+          <w:sz w:val="21"/>
+          <w:lang w:eastAsia="ko-KR"/>
+        </w:rPr>
+        <w:t>재학습</w:t>
+      </w:r>
+      <w:r>
+        <w:rPr>
+          <w:sz w:val="21"/>
+          <w:lang w:eastAsia="ko-KR"/>
+        </w:rPr>
+        <w:t xml:space="preserve"> </w:t>
+      </w:r>
+      <w:r>
+        <w:rPr>
+          <w:sz w:val="21"/>
+          <w:lang w:eastAsia="ko-KR"/>
+        </w:rPr>
+        <w:t>없이</w:t>
+      </w:r>
+      <w:r>
+        <w:rPr>
+          <w:sz w:val="21"/>
+          <w:lang w:eastAsia="ko-KR"/>
+        </w:rPr>
+        <w:t xml:space="preserve"> </w:t>
+      </w:r>
+      <w:r>
+        <w:rPr>
+          <w:sz w:val="21"/>
+          <w:lang w:eastAsia="ko-KR"/>
+        </w:rPr>
+        <w:t>월별</w:t>
+      </w:r>
+      <w:r>
+        <w:rPr>
+          <w:sz w:val="21"/>
+          <w:lang w:eastAsia="ko-KR"/>
+        </w:rPr>
+        <w:t xml:space="preserve"> </w:t>
+      </w:r>
+      <w:r>
+        <w:rPr>
+          <w:sz w:val="21"/>
+          <w:lang w:eastAsia="ko-KR"/>
+        </w:rPr>
+        <w:t>갱신</w:t>
+      </w:r>
+    </w:p>
+    <w:p>
+      <w:pPr>
+        <w:pStyle w:val="a0"/>
+        <w:spacing w:after="40"/>
+        <w:ind w:left="227"/>
+        <w:rPr>
+          <w:lang w:eastAsia="ko-KR"/>
+        </w:rPr>
+      </w:pPr>
+      <w:r>
+        <w:rPr>
+          <w:sz w:val="21"/>
+          <w:lang w:eastAsia="ko-KR"/>
+        </w:rPr>
+        <w:t xml:space="preserve">Z-score </w:t>
+      </w:r>
+      <w:r>
+        <w:rPr>
+          <w:sz w:val="21"/>
+          <w:lang w:eastAsia="ko-KR"/>
+        </w:rPr>
+        <w:t>기반</w:t>
+      </w:r>
+      <w:r>
+        <w:rPr>
+          <w:sz w:val="21"/>
+          <w:lang w:eastAsia="ko-KR"/>
+        </w:rPr>
+        <w:t xml:space="preserve"> </w:t>
+      </w:r>
+      <w:r>
+        <w:rPr>
+          <w:sz w:val="21"/>
+          <w:lang w:eastAsia="ko-KR"/>
+        </w:rPr>
+        <w:t>추세</w:t>
+      </w:r>
+      <w:r>
+        <w:rPr>
+          <w:sz w:val="21"/>
+          <w:lang w:eastAsia="ko-KR"/>
+        </w:rPr>
+        <w:t xml:space="preserve"> </w:t>
+      </w:r>
+      <w:r>
+        <w:rPr>
+          <w:sz w:val="21"/>
+          <w:lang w:eastAsia="ko-KR"/>
+        </w:rPr>
+        <w:t>이탈</w:t>
+      </w:r>
+      <w:r>
+        <w:rPr>
+          <w:sz w:val="21"/>
+          <w:lang w:eastAsia="ko-KR"/>
+        </w:rPr>
+        <w:t xml:space="preserve"> + </w:t>
+      </w:r>
+      <w:r>
+        <w:rPr>
+          <w:sz w:val="21"/>
+          <w:lang w:eastAsia="ko-KR"/>
+        </w:rPr>
+        <w:t>다변량</w:t>
+      </w:r>
+      <w:r>
+        <w:rPr>
+          <w:sz w:val="21"/>
+          <w:lang w:eastAsia="ko-KR"/>
+        </w:rPr>
+        <w:t xml:space="preserve"> Isolation Forest </w:t>
+      </w:r>
+      <w:r>
+        <w:rPr>
+          <w:sz w:val="21"/>
+          <w:lang w:eastAsia="ko-KR"/>
+        </w:rPr>
+        <w:t>결합으로</w:t>
+      </w:r>
+      <w:r>
+        <w:rPr>
+          <w:sz w:val="21"/>
+          <w:lang w:eastAsia="ko-KR"/>
+        </w:rPr>
+        <w:t xml:space="preserve"> </w:t>
+      </w:r>
+      <w:r>
+        <w:rPr>
+          <w:rFonts w:ascii="맑은 고딕" w:eastAsia="맑은 고딕" w:hAnsi="맑은 고딕" w:cs="맑은 고딕" w:hint="eastAsia"/>
+          <w:lang w:eastAsia="ko-KR"/>
+        </w:rPr>
+        <w:t>단일</w:t>
+      </w:r>
+      <w:r>
+        <w:rPr>
+          <w:lang w:eastAsia="ko-KR"/>
+        </w:rPr>
+        <w:t xml:space="preserve"> </w:t>
+      </w:r>
+      <w:r>
+        <w:rPr>
+          <w:rFonts w:ascii="맑은 고딕" w:eastAsia="맑은 고딕" w:hAnsi="맑은 고딕" w:cs="맑은 고딕" w:hint="eastAsia"/>
+          <w:lang w:eastAsia="ko-KR"/>
+        </w:rPr>
+        <w:t>모델</w:t>
+      </w:r>
+      <w:r>
+        <w:rPr>
+          <w:lang w:eastAsia="ko-KR"/>
+        </w:rPr>
+        <w:t xml:space="preserve"> </w:t>
+      </w:r>
+      <w:r>
+        <w:rPr>
+          <w:rFonts w:ascii="맑은 고딕" w:eastAsia="맑은 고딕" w:hAnsi="맑은 고딕" w:cs="맑은 고딕" w:hint="eastAsia"/>
+          <w:lang w:eastAsia="ko-KR"/>
+        </w:rPr>
+        <w:t>결과만</w:t>
+      </w:r>
+      <w:r>
+        <w:rPr>
+          <w:lang w:eastAsia="ko-KR"/>
+        </w:rPr>
+        <w:t xml:space="preserve"> </w:t>
+      </w:r>
+      <w:r>
+        <w:rPr>
+          <w:rFonts w:ascii="맑은 고딕" w:eastAsia="맑은 고딕" w:hAnsi="맑은 고딕" w:cs="맑은 고딕" w:hint="eastAsia"/>
+          <w:lang w:eastAsia="ko-KR"/>
+        </w:rPr>
+        <w:t>보는</w:t>
+      </w:r>
+      <w:r>
+        <w:rPr>
+          <w:lang w:eastAsia="ko-KR"/>
+        </w:rPr>
+        <w:t xml:space="preserve"> </w:t>
+      </w:r>
+      <w:r>
+        <w:rPr>
+          <w:rFonts w:ascii="맑은 고딕" w:eastAsia="맑은 고딕" w:hAnsi="맑은 고딕" w:cs="맑은 고딕" w:hint="eastAsia"/>
+          <w:lang w:eastAsia="ko-KR"/>
+        </w:rPr>
+        <w:t>한계를</w:t>
+      </w:r>
+      <w:r>
+        <w:rPr>
+          <w:lang w:eastAsia="ko-KR"/>
+        </w:rPr>
+        <w:t xml:space="preserve"> </w:t>
+      </w:r>
+      <w:r>
+        <w:rPr>
+          <w:rFonts w:ascii="맑은 고딕" w:eastAsia="맑은 고딕" w:hAnsi="맑은 고딕" w:cs="맑은 고딕" w:hint="eastAsia"/>
+          <w:lang w:eastAsia="ko-KR"/>
+        </w:rPr>
+        <w:t>줄이기</w:t>
+      </w:r>
+      <w:r>
+        <w:rPr>
+          <w:lang w:eastAsia="ko-KR"/>
+        </w:rPr>
+        <w:t xml:space="preserve"> </w:t>
+      </w:r>
+      <w:r>
+        <w:rPr>
+          <w:rFonts w:ascii="맑은 고딕" w:eastAsia="맑은 고딕" w:hAnsi="맑은 고딕" w:cs="맑은 고딕" w:hint="eastAsia"/>
+          <w:lang w:eastAsia="ko-KR"/>
+        </w:rPr>
+        <w:t>위해</w:t>
+      </w:r>
+      <w:r>
+        <w:rPr>
+          <w:lang w:eastAsia="ko-KR"/>
+        </w:rPr>
+        <w:t>,</w:t>
+      </w:r>
+      <w:r>
+        <w:rPr>
+          <w:rFonts w:ascii="맑은 고딕" w:eastAsia="맑은 고딕" w:hAnsi="맑은 고딕" w:cs="맑은 고딕" w:hint="eastAsia"/>
+          <w:lang w:eastAsia="ko-KR"/>
+        </w:rPr>
+        <w:t>다변량</w:t>
+      </w:r>
+      <w:r>
+        <w:rPr>
+          <w:lang w:eastAsia="ko-KR"/>
+        </w:rPr>
+        <w:t xml:space="preserve"> </w:t>
+      </w:r>
+      <w:r>
+        <w:rPr>
+          <w:rFonts w:ascii="맑은 고딕" w:eastAsia="맑은 고딕" w:hAnsi="맑은 고딕" w:cs="맑은 고딕" w:hint="eastAsia"/>
+          <w:lang w:eastAsia="ko-KR"/>
+        </w:rPr>
+        <w:t>이상</w:t>
+      </w:r>
+      <w:r>
+        <w:rPr>
+          <w:lang w:eastAsia="ko-KR"/>
+        </w:rPr>
+        <w:t xml:space="preserve"> </w:t>
+      </w:r>
+      <w:r>
+        <w:rPr>
+          <w:rFonts w:ascii="맑은 고딕" w:eastAsia="맑은 고딕" w:hAnsi="맑은 고딕" w:cs="맑은 고딕" w:hint="eastAsia"/>
+          <w:lang w:eastAsia="ko-KR"/>
+        </w:rPr>
+        <w:t>탐지와</w:t>
+      </w:r>
+      <w:r>
+        <w:rPr>
+          <w:lang w:eastAsia="ko-KR"/>
+        </w:rPr>
+        <w:t xml:space="preserve"> </w:t>
+      </w:r>
+      <w:r>
+        <w:rPr>
+          <w:rFonts w:ascii="맑은 고딕" w:eastAsia="맑은 고딕" w:hAnsi="맑은 고딕" w:cs="맑은 고딕" w:hint="eastAsia"/>
+          <w:lang w:eastAsia="ko-KR"/>
+        </w:rPr>
+        <w:t>추세</w:t>
+      </w:r>
+      <w:r>
+        <w:rPr>
+          <w:lang w:eastAsia="ko-KR"/>
+        </w:rPr>
+        <w:t xml:space="preserve"> </w:t>
+      </w:r>
+      <w:r>
+        <w:rPr>
+          <w:rFonts w:ascii="맑은 고딕" w:eastAsia="맑은 고딕" w:hAnsi="맑은 고딕" w:cs="맑은 고딕" w:hint="eastAsia"/>
+          <w:lang w:eastAsia="ko-KR"/>
+        </w:rPr>
+        <w:t>이탈</w:t>
+      </w:r>
+      <w:r>
+        <w:rPr>
+          <w:lang w:eastAsia="ko-KR"/>
+        </w:rPr>
+        <w:t xml:space="preserve"> </w:t>
+      </w:r>
+      <w:r>
+        <w:rPr>
+          <w:rFonts w:ascii="맑은 고딕" w:eastAsia="맑은 고딕" w:hAnsi="맑은 고딕" w:cs="맑은 고딕" w:hint="eastAsia"/>
+          <w:lang w:eastAsia="ko-KR"/>
+        </w:rPr>
+        <w:t>지표를</w:t>
+      </w:r>
+      <w:r>
+        <w:rPr>
+          <w:lang w:eastAsia="ko-KR"/>
+        </w:rPr>
+        <w:t xml:space="preserve"> </w:t>
+      </w:r>
+      <w:r>
+        <w:rPr>
+          <w:rFonts w:ascii="맑은 고딕" w:eastAsia="맑은 고딕" w:hAnsi="맑은 고딕" w:cs="맑은 고딕" w:hint="eastAsia"/>
+          <w:lang w:eastAsia="ko-KR"/>
+        </w:rPr>
+        <w:t>함께</w:t>
+      </w:r>
+      <w:r>
+        <w:rPr>
+          <w:lang w:eastAsia="ko-KR"/>
+        </w:rPr>
+        <w:t xml:space="preserve"> </w:t>
+      </w:r>
+      <w:r>
+        <w:rPr>
+          <w:rFonts w:ascii="맑은 고딕" w:eastAsia="맑은 고딕" w:hAnsi="맑은 고딕" w:cs="맑은 고딕" w:hint="eastAsia"/>
+          <w:lang w:eastAsia="ko-KR"/>
+        </w:rPr>
+        <w:t>제공하도록</w:t>
+      </w:r>
+      <w:r>
+        <w:rPr>
+          <w:lang w:eastAsia="ko-KR"/>
+        </w:rPr>
+        <w:t xml:space="preserve"> </w:t>
+      </w:r>
+      <w:r>
+        <w:rPr>
+          <w:rFonts w:ascii="맑은 고딕" w:eastAsia="맑은 고딕" w:hAnsi="맑은 고딕" w:cs="맑은 고딕" w:hint="eastAsia"/>
+          <w:lang w:eastAsia="ko-KR"/>
+        </w:rPr>
+        <w:t>설계했습니다</w:t>
+      </w:r>
+      <w:r>
+        <w:rPr>
+          <w:lang w:eastAsia="ko-KR"/>
+        </w:rPr>
+        <w:t>.</w:t>
+      </w:r>
+    </w:p>
+    <w:p>
+      <w:pPr>
+        <w:spacing w:before="240" w:after="80"/>
+      </w:pPr>
+      <w:r>
+        <w:rPr>
+          <w:b/>
+          <w:color w:val="1A1A2E"/>
+          <w:sz w:val="28"/>
+        </w:rPr>
+        <w:t xml:space="preserve">Flask API </w:t>
+      </w:r>
+      <w:proofErr w:type="spellStart"/>
+      <w:r>
+        <w:rPr>
+          <w:b/>
+          <w:color w:val="1A1A2E"/>
+          <w:sz w:val="28"/>
+        </w:rPr>
+        <w:t>설계</w:t>
+      </w:r>
+      <w:bookmarkStart w:id="0" w:name="_GoBack"/>
+      <w:bookmarkEnd w:id="0"/>
       <w:proofErr w:type="spellEnd"/>
     </w:p>
     <w:p>
@@ -15677,596 +16527,95 @@
         <w:rPr>
           <w:sz w:val="21"/>
         </w:rPr>
-        <w:t xml:space="preserve">Selenium + </w:t>
+        <w:t>20</w:t>
+      </w:r>
+      <w:r>
+        <w:rPr>
+          <w:sz w:val="21"/>
+        </w:rPr>
+        <w:t>개</w:t>
+      </w:r>
+      <w:r>
+        <w:rPr>
+          <w:sz w:val="21"/>
+        </w:rPr>
+        <w:t xml:space="preserve"> </w:t>
       </w:r>
       <w:proofErr w:type="spellStart"/>
       <w:r>
         <w:rPr>
           <w:sz w:val="21"/>
         </w:rPr>
-        <w:t>WebDriverManager</w:t>
+        <w:t>이상</w:t>
       </w:r>
       <w:proofErr w:type="spellEnd"/>
       <w:r>
         <w:rPr>
           <w:sz w:val="21"/>
         </w:rPr>
-        <w:t xml:space="preserve"> </w:t>
+        <w:t xml:space="preserve"> REST </w:t>
       </w:r>
       <w:proofErr w:type="spellStart"/>
       <w:r>
         <w:rPr>
           <w:sz w:val="21"/>
         </w:rPr>
-        <w:t>기반</w:t>
+        <w:t>엔드포인</w:t>
       </w:r>
       <w:proofErr w:type="spellEnd"/>
       <w:r>
         <w:rPr>
           <w:sz w:val="21"/>
         </w:rPr>
-        <w:t xml:space="preserve"> </w:t>
+        <w:t>트</w:t>
+      </w:r>
+      <w:r>
+        <w:rPr>
+          <w:sz w:val="21"/>
+        </w:rPr>
+        <w:t>: /</w:t>
       </w:r>
       <w:proofErr w:type="spellStart"/>
       <w:r>
         <w:rPr>
           <w:sz w:val="21"/>
         </w:rPr>
-        <w:t>Seibro</w:t>
+        <w:t>api</w:t>
       </w:r>
       <w:proofErr w:type="spellEnd"/>
       <w:r>
         <w:rPr>
           <w:sz w:val="21"/>
         </w:rPr>
-        <w:t xml:space="preserve"> </w:t>
+        <w:t>/{</w:t>
       </w:r>
       <w:proofErr w:type="spellStart"/>
       <w:r>
         <w:rPr>
           <w:sz w:val="21"/>
         </w:rPr>
-        <w:t>자동</w:t>
+        <w:t>cp|abcp|ab</w:t>
       </w:r>
       <w:proofErr w:type="spellEnd"/>
       <w:r>
         <w:rPr>
           <w:sz w:val="21"/>
         </w:rPr>
-        <w:t xml:space="preserve"> </w:t>
+        <w:t>}/{</w:t>
       </w:r>
       <w:proofErr w:type="spellStart"/>
       <w:r>
         <w:rPr>
           <w:sz w:val="21"/>
         </w:rPr>
-        <w:t>크롤링</w:t>
+        <w:t>balance|issue|tenor|grade</w:t>
       </w:r>
       <w:proofErr w:type="spellEnd"/>
-    </w:p>
-    <w:p>
-      <w:pPr>
-        <w:pStyle w:val="a0"/>
-        <w:spacing w:after="40"/>
-        <w:ind w:left="227"/>
-        <w:rPr>
-          <w:lang w:eastAsia="ko-KR"/>
-        </w:rPr>
-      </w:pPr>
-      <w:r>
-        <w:rPr>
-          <w:sz w:val="21"/>
-          <w:lang w:eastAsia="ko-KR"/>
-        </w:rPr>
-        <w:t>다양한</w:t>
-      </w:r>
-      <w:r>
-        <w:rPr>
-          <w:sz w:val="21"/>
-          <w:lang w:eastAsia="ko-KR"/>
-        </w:rPr>
-        <w:t xml:space="preserve"> </w:t>
-      </w:r>
-      <w:proofErr w:type="spellStart"/>
-      <w:r>
-        <w:rPr>
-          <w:sz w:val="21"/>
-          <w:lang w:eastAsia="ko-KR"/>
-        </w:rPr>
-        <w:t>인코딩</w:t>
-      </w:r>
-      <w:proofErr w:type="spellEnd"/>
-      <w:r>
-        <w:rPr>
-          <w:sz w:val="21"/>
-          <w:lang w:eastAsia="ko-KR"/>
-        </w:rPr>
-        <w:t xml:space="preserve">(UTF-8-sig / CP949) </w:t>
-      </w:r>
-      <w:r>
-        <w:rPr>
-          <w:sz w:val="21"/>
-          <w:lang w:eastAsia="ko-KR"/>
-        </w:rPr>
-        <w:t>자동</w:t>
-      </w:r>
-      <w:r>
-        <w:rPr>
-          <w:sz w:val="21"/>
-          <w:lang w:eastAsia="ko-KR"/>
-        </w:rPr>
-        <w:t xml:space="preserve"> </w:t>
-      </w:r>
-      <w:r>
-        <w:rPr>
-          <w:sz w:val="21"/>
-          <w:lang w:eastAsia="ko-KR"/>
-        </w:rPr>
-        <w:t>감지</w:t>
-      </w:r>
-      <w:r>
-        <w:rPr>
-          <w:sz w:val="21"/>
-          <w:lang w:eastAsia="ko-KR"/>
-        </w:rPr>
-        <w:t xml:space="preserve"> CSV </w:t>
-      </w:r>
-      <w:proofErr w:type="spellStart"/>
-      <w:r>
-        <w:rPr>
-          <w:sz w:val="21"/>
-          <w:lang w:eastAsia="ko-KR"/>
-        </w:rPr>
-        <w:t>로더</w:t>
-      </w:r>
-      <w:proofErr w:type="spellEnd"/>
-    </w:p>
-    <w:p>
-      <w:pPr>
-        <w:pStyle w:val="a0"/>
-        <w:spacing w:after="40"/>
-        <w:ind w:left="227"/>
-        <w:rPr>
-          <w:lang w:eastAsia="ko-KR"/>
-        </w:rPr>
-      </w:pPr>
-      <w:r>
-        <w:rPr>
-          <w:sz w:val="21"/>
-          <w:lang w:eastAsia="ko-KR"/>
-        </w:rPr>
-        <w:t>신용등급</w:t>
-      </w:r>
-      <w:r>
-        <w:rPr>
-          <w:sz w:val="21"/>
-          <w:lang w:eastAsia="ko-KR"/>
-        </w:rPr>
-        <w:t xml:space="preserve"> </w:t>
-      </w:r>
-      <w:r>
-        <w:rPr>
-          <w:sz w:val="21"/>
-          <w:lang w:eastAsia="ko-KR"/>
-        </w:rPr>
-        <w:t>정규화</w:t>
-      </w:r>
-      <w:r>
-        <w:rPr>
-          <w:sz w:val="21"/>
-          <w:lang w:eastAsia="ko-KR"/>
-        </w:rPr>
-        <w:t xml:space="preserve">: </w:t>
-      </w:r>
-      <w:proofErr w:type="spellStart"/>
-      <w:r>
-        <w:rPr>
-          <w:sz w:val="21"/>
-          <w:lang w:eastAsia="ko-KR"/>
-        </w:rPr>
-        <w:t>전각문자</w:t>
-      </w:r>
-      <w:proofErr w:type="spellEnd"/>
-      <w:r>
-        <w:rPr>
-          <w:sz w:val="21"/>
-          <w:lang w:eastAsia="ko-KR"/>
-        </w:rPr>
-        <w:t>·</w:t>
-      </w:r>
-      <w:r>
-        <w:rPr>
-          <w:sz w:val="21"/>
-          <w:lang w:eastAsia="ko-KR"/>
-        </w:rPr>
-        <w:t>특수기호</w:t>
-      </w:r>
-      <w:r>
-        <w:rPr>
-          <w:sz w:val="21"/>
-          <w:lang w:eastAsia="ko-KR"/>
-        </w:rPr>
-        <w:t xml:space="preserve"> </w:t>
-      </w:r>
-      <w:r>
-        <w:rPr>
-          <w:sz w:val="21"/>
-          <w:lang w:eastAsia="ko-KR"/>
-        </w:rPr>
-        <w:t>포함</w:t>
-      </w:r>
-      <w:r>
-        <w:rPr>
-          <w:sz w:val="21"/>
-          <w:lang w:eastAsia="ko-KR"/>
-        </w:rPr>
-        <w:t xml:space="preserve"> </w:t>
-      </w:r>
-      <w:r>
-        <w:rPr>
-          <w:sz w:val="21"/>
-          <w:lang w:eastAsia="ko-KR"/>
-        </w:rPr>
-        <w:t>원천</w:t>
-      </w:r>
-      <w:r>
-        <w:rPr>
-          <w:sz w:val="21"/>
-          <w:lang w:eastAsia="ko-KR"/>
-        </w:rPr>
-        <w:t xml:space="preserve"> → A1/A2+/A2/… </w:t>
-      </w:r>
-      <w:r>
-        <w:rPr>
-          <w:sz w:val="21"/>
-          <w:lang w:eastAsia="ko-KR"/>
-        </w:rPr>
-        <w:t>표준</w:t>
-      </w:r>
-      <w:r>
-        <w:rPr>
-          <w:sz w:val="21"/>
-          <w:lang w:eastAsia="ko-KR"/>
-        </w:rPr>
-        <w:t xml:space="preserve"> </w:t>
-      </w:r>
-      <w:r>
-        <w:rPr>
-          <w:sz w:val="21"/>
-          <w:lang w:eastAsia="ko-KR"/>
-        </w:rPr>
-        <w:t>코드</w:t>
-      </w:r>
-    </w:p>
-    <w:p>
-      <w:pPr>
-        <w:pStyle w:val="a0"/>
-        <w:spacing w:after="40"/>
-        <w:ind w:left="227"/>
-        <w:rPr>
-          <w:lang w:eastAsia="ko-KR"/>
-        </w:rPr>
-      </w:pPr>
-      <w:r>
-        <w:rPr>
-          <w:sz w:val="21"/>
-          <w:lang w:eastAsia="ko-KR"/>
-        </w:rPr>
-        <w:t>월별</w:t>
-      </w:r>
-      <w:r>
-        <w:rPr>
-          <w:sz w:val="21"/>
-          <w:lang w:eastAsia="ko-KR"/>
-        </w:rPr>
-        <w:t xml:space="preserve"> incremental append: </w:t>
-      </w:r>
-      <w:r>
-        <w:rPr>
-          <w:sz w:val="21"/>
-          <w:lang w:eastAsia="ko-KR"/>
-        </w:rPr>
-        <w:t>이전</w:t>
-      </w:r>
-      <w:r>
-        <w:rPr>
-          <w:sz w:val="21"/>
-          <w:lang w:eastAsia="ko-KR"/>
-        </w:rPr>
-        <w:t xml:space="preserve"> </w:t>
-      </w:r>
-      <w:proofErr w:type="spellStart"/>
-      <w:r>
-        <w:rPr>
-          <w:sz w:val="21"/>
-          <w:lang w:eastAsia="ko-KR"/>
-        </w:rPr>
-        <w:t>누적본</w:t>
-      </w:r>
-      <w:proofErr w:type="spellEnd"/>
-      <w:r>
-        <w:rPr>
-          <w:sz w:val="21"/>
-          <w:lang w:eastAsia="ko-KR"/>
-        </w:rPr>
-        <w:t xml:space="preserve"> + </w:t>
-      </w:r>
-      <w:r>
-        <w:rPr>
-          <w:sz w:val="21"/>
-          <w:lang w:eastAsia="ko-KR"/>
-        </w:rPr>
-        <w:t>신규</w:t>
-      </w:r>
-      <w:r>
-        <w:rPr>
-          <w:sz w:val="21"/>
-          <w:lang w:eastAsia="ko-KR"/>
-        </w:rPr>
-        <w:t xml:space="preserve"> 1</w:t>
-      </w:r>
-      <w:r>
-        <w:rPr>
-          <w:sz w:val="21"/>
-          <w:lang w:eastAsia="ko-KR"/>
-        </w:rPr>
-        <w:t>개월</w:t>
-      </w:r>
-      <w:r>
-        <w:rPr>
-          <w:sz w:val="21"/>
-          <w:lang w:eastAsia="ko-KR"/>
-        </w:rPr>
-        <w:t xml:space="preserve"> → </w:t>
-      </w:r>
-      <w:r>
-        <w:rPr>
-          <w:sz w:val="21"/>
-          <w:lang w:eastAsia="ko-KR"/>
-        </w:rPr>
-        <w:t>중복</w:t>
-      </w:r>
-      <w:r>
-        <w:rPr>
-          <w:sz w:val="21"/>
-          <w:lang w:eastAsia="ko-KR"/>
-        </w:rPr>
-        <w:t xml:space="preserve"> </w:t>
-      </w:r>
-      <w:r>
-        <w:rPr>
-          <w:sz w:val="21"/>
-          <w:lang w:eastAsia="ko-KR"/>
-        </w:rPr>
-        <w:t>제거</w:t>
-      </w:r>
-      <w:r>
-        <w:rPr>
-          <w:sz w:val="21"/>
-          <w:lang w:eastAsia="ko-KR"/>
-        </w:rPr>
-        <w:t xml:space="preserve"> </w:t>
-      </w:r>
-      <w:r>
-        <w:rPr>
-          <w:sz w:val="21"/>
-          <w:lang w:eastAsia="ko-KR"/>
-        </w:rPr>
-        <w:t>후</w:t>
-      </w:r>
-      <w:r>
-        <w:rPr>
-          <w:sz w:val="21"/>
-          <w:lang w:eastAsia="ko-KR"/>
-        </w:rPr>
-        <w:t xml:space="preserve"> </w:t>
-      </w:r>
-      <w:r>
-        <w:rPr>
-          <w:sz w:val="21"/>
-          <w:lang w:eastAsia="ko-KR"/>
-        </w:rPr>
-        <w:t>저장</w:t>
-      </w:r>
-    </w:p>
-    <w:p>
-      <w:pPr>
-        <w:spacing w:before="240" w:after="80"/>
-      </w:pPr>
-      <w:r>
-        <w:rPr>
-          <w:b/>
-          <w:color w:val="1A1A2E"/>
-          <w:sz w:val="28"/>
-        </w:rPr>
-        <w:t xml:space="preserve">ML </w:t>
-      </w:r>
-      <w:proofErr w:type="spellStart"/>
-      <w:r>
-        <w:rPr>
-          <w:b/>
-          <w:color w:val="1A1A2E"/>
-          <w:sz w:val="28"/>
-        </w:rPr>
-        <w:t>파이프라인</w:t>
-      </w:r>
-      <w:proofErr w:type="spellEnd"/>
-    </w:p>
-    <w:p>
-      <w:pPr>
-        <w:pStyle w:val="a0"/>
-        <w:spacing w:after="40"/>
-        <w:ind w:left="227"/>
-        <w:rPr>
-          <w:lang w:eastAsia="ko-KR"/>
-        </w:rPr>
-      </w:pPr>
-      <w:r>
-        <w:rPr>
-          <w:sz w:val="21"/>
-          <w:lang w:eastAsia="ko-KR"/>
-        </w:rPr>
-        <w:t>학습은</w:t>
-      </w:r>
-      <w:r>
-        <w:rPr>
-          <w:sz w:val="21"/>
-          <w:lang w:eastAsia="ko-KR"/>
-        </w:rPr>
-        <w:t xml:space="preserve"> </w:t>
-      </w:r>
-      <w:r>
-        <w:rPr>
-          <w:sz w:val="21"/>
-          <w:lang w:eastAsia="ko-KR"/>
-        </w:rPr>
-        <w:t>최초</w:t>
-      </w:r>
-      <w:r>
-        <w:rPr>
-          <w:sz w:val="21"/>
-          <w:lang w:eastAsia="ko-KR"/>
-        </w:rPr>
-        <w:t xml:space="preserve"> 1</w:t>
-      </w:r>
-      <w:r>
-        <w:rPr>
-          <w:sz w:val="21"/>
-          <w:lang w:eastAsia="ko-KR"/>
-        </w:rPr>
-        <w:t>회</w:t>
-      </w:r>
-      <w:r>
-        <w:rPr>
-          <w:sz w:val="21"/>
-          <w:lang w:eastAsia="ko-KR"/>
-        </w:rPr>
-        <w:t xml:space="preserve">, </w:t>
-      </w:r>
-      <w:r>
-        <w:rPr>
-          <w:sz w:val="21"/>
-          <w:lang w:eastAsia="ko-KR"/>
-        </w:rPr>
-        <w:t>이후</w:t>
-      </w:r>
-      <w:r>
-        <w:rPr>
-          <w:sz w:val="21"/>
-          <w:lang w:eastAsia="ko-KR"/>
-        </w:rPr>
-        <w:t xml:space="preserve"> </w:t>
-      </w:r>
-      <w:proofErr w:type="spellStart"/>
-      <w:r>
-        <w:rPr>
-          <w:sz w:val="21"/>
-          <w:lang w:eastAsia="ko-KR"/>
-        </w:rPr>
-        <w:t>apply_saved_model</w:t>
-      </w:r>
-      <w:proofErr w:type="spellEnd"/>
-      <w:r>
-        <w:rPr>
-          <w:sz w:val="21"/>
-          <w:lang w:eastAsia="ko-KR"/>
-        </w:rPr>
-        <w:t>()</w:t>
-      </w:r>
-      <w:r>
-        <w:rPr>
-          <w:sz w:val="21"/>
-          <w:lang w:eastAsia="ko-KR"/>
-        </w:rPr>
-        <w:t>로</w:t>
-      </w:r>
-      <w:r>
-        <w:rPr>
-          <w:sz w:val="21"/>
-          <w:lang w:eastAsia="ko-KR"/>
-        </w:rPr>
-        <w:t xml:space="preserve"> </w:t>
-      </w:r>
-      <w:proofErr w:type="spellStart"/>
-      <w:r>
-        <w:rPr>
-          <w:sz w:val="21"/>
-          <w:lang w:eastAsia="ko-KR"/>
-        </w:rPr>
-        <w:t>pkl</w:t>
-      </w:r>
-      <w:proofErr w:type="spellEnd"/>
-      <w:r>
-        <w:rPr>
-          <w:sz w:val="21"/>
-          <w:lang w:eastAsia="ko-KR"/>
-        </w:rPr>
-        <w:t xml:space="preserve"> </w:t>
-      </w:r>
-      <w:r>
-        <w:rPr>
-          <w:sz w:val="21"/>
-          <w:lang w:eastAsia="ko-KR"/>
-        </w:rPr>
-        <w:t>재사용</w:t>
-      </w:r>
-      <w:r>
-        <w:rPr>
-          <w:sz w:val="21"/>
-          <w:lang w:eastAsia="ko-KR"/>
-        </w:rPr>
-        <w:t xml:space="preserve"> → </w:t>
-      </w:r>
-      <w:proofErr w:type="spellStart"/>
-      <w:r>
-        <w:rPr>
-          <w:sz w:val="21"/>
-          <w:lang w:eastAsia="ko-KR"/>
-        </w:rPr>
-        <w:t>재학습</w:t>
-      </w:r>
-      <w:proofErr w:type="spellEnd"/>
-      <w:r>
-        <w:rPr>
-          <w:sz w:val="21"/>
-          <w:lang w:eastAsia="ko-KR"/>
-        </w:rPr>
-        <w:t xml:space="preserve"> </w:t>
-      </w:r>
-      <w:r>
-        <w:rPr>
-          <w:sz w:val="21"/>
-          <w:lang w:eastAsia="ko-KR"/>
-        </w:rPr>
-        <w:t>없이</w:t>
-      </w:r>
-      <w:r>
-        <w:rPr>
-          <w:sz w:val="21"/>
-          <w:lang w:eastAsia="ko-KR"/>
-        </w:rPr>
-        <w:t xml:space="preserve"> </w:t>
-      </w:r>
-      <w:r>
-        <w:rPr>
-          <w:sz w:val="21"/>
-          <w:lang w:eastAsia="ko-KR"/>
-        </w:rPr>
-        <w:t>월별</w:t>
-      </w:r>
-      <w:r>
-        <w:rPr>
-          <w:sz w:val="21"/>
-          <w:lang w:eastAsia="ko-KR"/>
-        </w:rPr>
-        <w:t xml:space="preserve"> </w:t>
-      </w:r>
-      <w:r>
-        <w:rPr>
-          <w:sz w:val="21"/>
-          <w:lang w:eastAsia="ko-KR"/>
-        </w:rPr>
-        <w:t>갱신</w:t>
+      <w:r>
+        <w:rPr>
+          <w:sz w:val="21"/>
+        </w:rPr>
+        <w:t>}</w:t>
       </w:r>
     </w:p>
     <w:p>
@@ -16275,32 +16624,40 @@
         <w:spacing w:after="40"/>
         <w:ind w:left="227"/>
       </w:pPr>
-      <w:r>
-        <w:rPr>
-          <w:sz w:val="21"/>
-        </w:rPr>
-        <w:t xml:space="preserve">Z-score </w:t>
+      <w:proofErr w:type="gramStart"/>
+      <w:r>
+        <w:rPr>
+          <w:sz w:val="21"/>
+        </w:rPr>
+        <w:t>?from</w:t>
+      </w:r>
+      <w:proofErr w:type="gramEnd"/>
+      <w:r>
+        <w:rPr>
+          <w:sz w:val="21"/>
+        </w:rPr>
+        <w:t>=</w:t>
       </w:r>
       <w:proofErr w:type="spellStart"/>
       <w:r>
         <w:rPr>
           <w:sz w:val="21"/>
         </w:rPr>
-        <w:t>기반</w:t>
+        <w:t>YYYYMM&amp;to</w:t>
       </w:r>
       <w:proofErr w:type="spellEnd"/>
       <w:r>
         <w:rPr>
           <w:sz w:val="21"/>
         </w:rPr>
-        <w:t xml:space="preserve"> </w:t>
+        <w:t xml:space="preserve">=YYYYMM </w:t>
       </w:r>
       <w:proofErr w:type="spellStart"/>
       <w:r>
         <w:rPr>
           <w:sz w:val="21"/>
         </w:rPr>
-        <w:t>추세</w:t>
+        <w:t>파라미터</w:t>
       </w:r>
       <w:proofErr w:type="spellEnd"/>
       <w:r>
@@ -16314,86 +16671,35 @@
         <w:rPr>
           <w:sz w:val="21"/>
         </w:rPr>
-        <w:t>이탈</w:t>
+        <w:t>기간</w:t>
       </w:r>
       <w:proofErr w:type="spellEnd"/>
       <w:r>
         <w:rPr>
           <w:sz w:val="21"/>
         </w:rPr>
-        <w:t xml:space="preserve"> + </w:t>
+        <w:t xml:space="preserve"> </w:t>
       </w:r>
       <w:proofErr w:type="spellStart"/>
       <w:r>
         <w:rPr>
           <w:sz w:val="21"/>
         </w:rPr>
-        <w:t>다변량</w:t>
+        <w:t>필터</w:t>
       </w:r>
       <w:proofErr w:type="spellEnd"/>
       <w:r>
         <w:rPr>
           <w:sz w:val="21"/>
         </w:rPr>
-        <w:t xml:space="preserve"> Isolation Forest </w:t>
+        <w:t xml:space="preserve"> </w:t>
       </w:r>
       <w:proofErr w:type="spellStart"/>
       <w:r>
         <w:rPr>
           <w:sz w:val="21"/>
         </w:rPr>
-        <w:t>결합으로</w:t>
-      </w:r>
-      <w:proofErr w:type="spellEnd"/>
-      <w:r>
-        <w:rPr>
-          <w:sz w:val="21"/>
-        </w:rPr>
-        <w:t xml:space="preserve"> </w:t>
-      </w:r>
-      <w:proofErr w:type="spellStart"/>
-      <w:r>
-        <w:rPr>
-          <w:sz w:val="21"/>
-        </w:rPr>
-        <w:t>오탐</w:t>
-      </w:r>
-      <w:proofErr w:type="spellEnd"/>
-      <w:r>
-        <w:rPr>
-          <w:sz w:val="21"/>
-        </w:rPr>
-        <w:t xml:space="preserve"> </w:t>
-      </w:r>
-      <w:proofErr w:type="spellStart"/>
-      <w:r>
-        <w:rPr>
-          <w:sz w:val="21"/>
-        </w:rPr>
-        <w:t>감소</w:t>
-      </w:r>
-      <w:proofErr w:type="spellEnd"/>
-    </w:p>
-    <w:p>
-      <w:pPr>
-        <w:spacing w:before="240" w:after="80"/>
-      </w:pPr>
-      <w:r>
-        <w:rPr>
-          <w:b/>
-          <w:color w:val="1A1A2E"/>
-          <w:sz w:val="28"/>
-        </w:rPr>
-        <w:t xml:space="preserve">Flask API </w:t>
-      </w:r>
-      <w:proofErr w:type="spellStart"/>
-      <w:r>
-        <w:rPr>
-          <w:b/>
-          <w:color w:val="1A1A2E"/>
-          <w:sz w:val="28"/>
-        </w:rPr>
-        <w:t>설계</w:t>
+        <w:t>지원</w:t>
       </w:r>
       <w:proofErr w:type="spellEnd"/>
     </w:p>
@@ -16407,173 +16713,70 @@
         <w:rPr>
           <w:sz w:val="21"/>
         </w:rPr>
-        <w:t>20</w:t>
-      </w:r>
-      <w:r>
-        <w:rPr>
-          <w:sz w:val="21"/>
-        </w:rPr>
-        <w:t>개</w:t>
-      </w:r>
-      <w:r>
-        <w:rPr>
-          <w:sz w:val="21"/>
-        </w:rPr>
-        <w:t xml:space="preserve"> </w:t>
+        <w:t>/</w:t>
       </w:r>
       <w:proofErr w:type="spellStart"/>
       <w:r>
         <w:rPr>
           <w:sz w:val="21"/>
         </w:rPr>
-        <w:t>이상</w:t>
+        <w:t>api</w:t>
       </w:r>
       <w:proofErr w:type="spellEnd"/>
       <w:r>
         <w:rPr>
           <w:sz w:val="21"/>
         </w:rPr>
-        <w:t xml:space="preserve"> REST </w:t>
+        <w:t xml:space="preserve">/secure/model/latest: Decoy </w:t>
       </w:r>
       <w:proofErr w:type="spellStart"/>
       <w:r>
         <w:rPr>
           <w:sz w:val="21"/>
         </w:rPr>
+        <w:t>보안</w:t>
+      </w:r>
+      <w:proofErr w:type="spellEnd"/>
+      <w:r>
+        <w:rPr>
+          <w:sz w:val="21"/>
+        </w:rPr>
+        <w:t xml:space="preserve"> </w:t>
+      </w:r>
+      <w:proofErr w:type="spellStart"/>
+      <w:r>
+        <w:rPr>
+          <w:sz w:val="21"/>
+        </w:rPr>
+        <w:t>레이어</w:t>
+      </w:r>
+      <w:proofErr w:type="spellEnd"/>
+      <w:r>
+        <w:rPr>
+          <w:sz w:val="21"/>
+        </w:rPr>
+        <w:t xml:space="preserve"> </w:t>
+      </w:r>
+      <w:proofErr w:type="spellStart"/>
+      <w:r>
+        <w:rPr>
+          <w:sz w:val="21"/>
+        </w:rPr>
+        <w:t>적용</w:t>
+      </w:r>
+      <w:proofErr w:type="spellEnd"/>
+      <w:r>
+        <w:rPr>
+          <w:sz w:val="21"/>
+        </w:rPr>
+        <w:t xml:space="preserve"> </w:t>
+      </w:r>
+      <w:proofErr w:type="spellStart"/>
+      <w:r>
+        <w:rPr>
+          <w:sz w:val="21"/>
+        </w:rPr>
         <w:t>엔드포인트</w:t>
-      </w:r>
-      <w:proofErr w:type="spellEnd"/>
-      <w:r>
-        <w:rPr>
-          <w:sz w:val="21"/>
-        </w:rPr>
-        <w:t>: /</w:t>
-      </w:r>
-      <w:proofErr w:type="spellStart"/>
-      <w:r>
-        <w:rPr>
-          <w:sz w:val="21"/>
-        </w:rPr>
-        <w:t>api</w:t>
-      </w:r>
-      <w:proofErr w:type="spellEnd"/>
-      <w:r>
-        <w:rPr>
-          <w:sz w:val="21"/>
-        </w:rPr>
-        <w:t>/{</w:t>
-      </w:r>
-      <w:proofErr w:type="spellStart"/>
-      <w:r>
-        <w:rPr>
-          <w:sz w:val="21"/>
-        </w:rPr>
-        <w:t>cp|abcp|ab</w:t>
-      </w:r>
-      <w:proofErr w:type="spellEnd"/>
-      <w:r>
-        <w:rPr>
-          <w:sz w:val="21"/>
-        </w:rPr>
-        <w:t>}/{</w:t>
-      </w:r>
-      <w:proofErr w:type="spellStart"/>
-      <w:r>
-        <w:rPr>
-          <w:sz w:val="21"/>
-        </w:rPr>
-        <w:t>balance|issue|tenor|grade</w:t>
-      </w:r>
-      <w:proofErr w:type="spellEnd"/>
-      <w:r>
-        <w:rPr>
-          <w:sz w:val="21"/>
-        </w:rPr>
-        <w:t>}</w:t>
-      </w:r>
-    </w:p>
-    <w:p>
-      <w:pPr>
-        <w:pStyle w:val="a0"/>
-        <w:spacing w:after="40"/>
-        <w:ind w:left="227"/>
-      </w:pPr>
-      <w:proofErr w:type="gramStart"/>
-      <w:r>
-        <w:rPr>
-          <w:sz w:val="21"/>
-        </w:rPr>
-        <w:t>?from</w:t>
-      </w:r>
-      <w:proofErr w:type="gramEnd"/>
-      <w:r>
-        <w:rPr>
-          <w:sz w:val="21"/>
-        </w:rPr>
-        <w:t>=</w:t>
-      </w:r>
-      <w:proofErr w:type="spellStart"/>
-      <w:r>
-        <w:rPr>
-          <w:sz w:val="21"/>
-        </w:rPr>
-        <w:t>YYYYMM&amp;to</w:t>
-      </w:r>
-      <w:proofErr w:type="spellEnd"/>
-      <w:r>
-        <w:rPr>
-          <w:sz w:val="21"/>
-        </w:rPr>
-        <w:t xml:space="preserve">=YYYYMM </w:t>
-      </w:r>
-      <w:proofErr w:type="spellStart"/>
-      <w:r>
-        <w:rPr>
-          <w:sz w:val="21"/>
-        </w:rPr>
-        <w:t>파라미터</w:t>
-      </w:r>
-      <w:proofErr w:type="spellEnd"/>
-      <w:r>
-        <w:rPr>
-          <w:sz w:val="21"/>
-        </w:rPr>
-        <w:t xml:space="preserve"> </w:t>
-      </w:r>
-      <w:proofErr w:type="spellStart"/>
-      <w:r>
-        <w:rPr>
-          <w:sz w:val="21"/>
-        </w:rPr>
-        <w:t>기간</w:t>
-      </w:r>
-      <w:proofErr w:type="spellEnd"/>
-      <w:r>
-        <w:rPr>
-          <w:sz w:val="21"/>
-        </w:rPr>
-        <w:t xml:space="preserve"> </w:t>
-      </w:r>
-      <w:proofErr w:type="spellStart"/>
-      <w:r>
-        <w:rPr>
-          <w:sz w:val="21"/>
-        </w:rPr>
-        <w:t>필터</w:t>
-      </w:r>
-      <w:proofErr w:type="spellEnd"/>
-      <w:r>
-        <w:rPr>
-          <w:sz w:val="21"/>
-        </w:rPr>
-        <w:t xml:space="preserve"> </w:t>
-      </w:r>
-      <w:proofErr w:type="spellStart"/>
-      <w:r>
-        <w:rPr>
-          <w:sz w:val="21"/>
-        </w:rPr>
-        <w:t>지원</w:t>
       </w:r>
       <w:proofErr w:type="spellEnd"/>
     </w:p>
@@ -16587,83 +16790,6 @@
         <w:rPr>
           <w:sz w:val="21"/>
         </w:rPr>
-        <w:t>/</w:t>
-      </w:r>
-      <w:proofErr w:type="spellStart"/>
-      <w:r>
-        <w:rPr>
-          <w:sz w:val="21"/>
-        </w:rPr>
-        <w:t>api</w:t>
-      </w:r>
-      <w:proofErr w:type="spellEnd"/>
-      <w:r>
-        <w:rPr>
-          <w:sz w:val="21"/>
-        </w:rPr>
-        <w:t xml:space="preserve">/secure/model/latest: Decoy </w:t>
-      </w:r>
-      <w:proofErr w:type="spellStart"/>
-      <w:r>
-        <w:rPr>
-          <w:sz w:val="21"/>
-        </w:rPr>
-        <w:t>보안</w:t>
-      </w:r>
-      <w:proofErr w:type="spellEnd"/>
-      <w:r>
-        <w:rPr>
-          <w:sz w:val="21"/>
-        </w:rPr>
-        <w:t xml:space="preserve"> </w:t>
-      </w:r>
-      <w:proofErr w:type="spellStart"/>
-      <w:r>
-        <w:rPr>
-          <w:sz w:val="21"/>
-        </w:rPr>
-        <w:t>레이어</w:t>
-      </w:r>
-      <w:proofErr w:type="spellEnd"/>
-      <w:r>
-        <w:rPr>
-          <w:sz w:val="21"/>
-        </w:rPr>
-        <w:t xml:space="preserve"> </w:t>
-      </w:r>
-      <w:proofErr w:type="spellStart"/>
-      <w:r>
-        <w:rPr>
-          <w:sz w:val="21"/>
-        </w:rPr>
-        <w:t>적용</w:t>
-      </w:r>
-      <w:proofErr w:type="spellEnd"/>
-      <w:r>
-        <w:rPr>
-          <w:sz w:val="21"/>
-        </w:rPr>
-        <w:t xml:space="preserve"> </w:t>
-      </w:r>
-      <w:proofErr w:type="spellStart"/>
-      <w:r>
-        <w:rPr>
-          <w:sz w:val="21"/>
-        </w:rPr>
-        <w:t>엔드포인트</w:t>
-      </w:r>
-      <w:proofErr w:type="spellEnd"/>
-    </w:p>
-    <w:p>
-      <w:pPr>
-        <w:pStyle w:val="a0"/>
-        <w:spacing w:after="40"/>
-        <w:ind w:left="227"/>
-      </w:pPr>
-      <w:r>
-        <w:rPr>
-          <w:sz w:val="21"/>
-        </w:rPr>
         <w:t xml:space="preserve">Flask </w:t>
       </w:r>
       <w:proofErr w:type="spellStart"/>
@@ -17340,8 +17466,6 @@
         </w:pBdr>
         <w:spacing w:before="360" w:after="120"/>
       </w:pPr>
-      <w:bookmarkStart w:id="0" w:name="_GoBack"/>
-      <w:bookmarkEnd w:id="0"/>
       <w:r>
         <w:rPr>
           <w:b/>
@@ -17350,7 +17474,6 @@
         </w:rPr>
         <w:t xml:space="preserve">7. </w:t>
       </w:r>
-      <w:proofErr w:type="spellStart"/>
       <w:r>
         <w:rPr>
           <w:b/>
@@ -17359,7 +17482,6 @@
         </w:rPr>
         <w:t>주요</w:t>
       </w:r>
-      <w:proofErr w:type="spellEnd"/>
       <w:r>
         <w:rPr>
           <w:b/>
@@ -17770,6 +17892,7 @@
                 <w:color w:val="1A1A2E"/>
                 <w:sz w:val="20"/>
               </w:rPr>
+              <w:lastRenderedPageBreak/>
               <w:t>crawler.py</w:t>
             </w:r>
           </w:p>
@@ -17838,7 +17961,6 @@
                 <w:color w:val="1A1A2E"/>
                 <w:sz w:val="20"/>
               </w:rPr>
-              <w:lastRenderedPageBreak/>
               <w:t>Siebro</w:t>
             </w:r>
             <w:proofErr w:type="spellEnd"/>
@@ -17906,7 +18028,6 @@
               </w:rPr>
               <w:t xml:space="preserve"> Selenium </w:t>
             </w:r>
-            <w:proofErr w:type="spellStart"/>
             <w:r>
               <w:rPr>
                 <w:sz w:val="20"/>
@@ -17914,7 +18035,6 @@
               </w:rPr>
               <w:t>크롤러</w:t>
             </w:r>
-            <w:proofErr w:type="spellEnd"/>
           </w:p>
         </w:tc>
       </w:tr>
@@ -17999,7 +18119,6 @@
               </w:rPr>
               <w:t xml:space="preserve"> Selenium </w:t>
             </w:r>
-            <w:proofErr w:type="spellStart"/>
             <w:r>
               <w:rPr>
                 <w:sz w:val="20"/>
@@ -18007,7 +18126,6 @@
               </w:rPr>
               <w:t>크롤러</w:t>
             </w:r>
-            <w:proofErr w:type="spellEnd"/>
           </w:p>
         </w:tc>
       </w:tr>
@@ -20399,7 +20517,6 @@
       <w:pPr>
         <w:spacing w:before="240" w:after="80"/>
       </w:pPr>
-      <w:proofErr w:type="spellStart"/>
       <w:r>
         <w:rPr>
           <w:b/>
@@ -20408,7 +20525,6 @@
         </w:rPr>
         <w:t>한계</w:t>
       </w:r>
-      <w:proofErr w:type="spellEnd"/>
       <w:r>
         <w:rPr>
           <w:b/>
@@ -32895,7 +33011,7 @@
 </file>
 
 <file path=customXml/itemProps1.xml><?xml version="1.0" encoding="utf-8"?>
-<ds:datastoreItem xmlns:ds="http://schemas.openxmlformats.org/officeDocument/2006/customXml" ds:itemID="{6FB39375-485E-4F2B-98EF-56BF6A894ECD}">
+<ds:datastoreItem xmlns:ds="http://schemas.openxmlformats.org/officeDocument/2006/customXml" ds:itemID="{025A7D08-4FA6-4AF8-831E-03DE6F47F8F7}">
   <ds:schemaRefs>
     <ds:schemaRef ds:uri="http://schemas.openxmlformats.org/officeDocument/2006/bibliography"/>
   </ds:schemaRefs>

</xml_diff>